<commit_message>
Create booking detail and checkin in
</commit_message>
<xml_diff>
--- a/the-wild-oasis (Automatycznie odzyskany).docx
+++ b/the-wild-oasis (Automatycznie odzyskany).docx
@@ -20,67 +20,29 @@
         <w:rPr>
           <w:lang w:val="en-US"/>
         </w:rPr>
-        <w:t xml:space="preserve"> – use extension to </w:t>
-      </w:r>
-      <w:proofErr w:type="spellStart"/>
-      <w:r>
-        <w:rPr>
-          <w:lang w:val="en-US"/>
-        </w:rPr>
-        <w:t>vsc</w:t>
-      </w:r>
-      <w:proofErr w:type="spellEnd"/>
-      <w:r>
-        <w:rPr>
-          <w:lang w:val="en-US"/>
-        </w:rPr>
-        <w:t xml:space="preserve"> called </w:t>
-      </w:r>
-      <w:proofErr w:type="spellStart"/>
+        <w:t xml:space="preserve"> – use extension to vsc called </w:t>
+      </w:r>
       <w:r>
         <w:rPr>
           <w:b/>
           <w:bCs/>
           <w:lang w:val="en-US"/>
         </w:rPr>
-        <w:t>vscode</w:t>
-      </w:r>
-      <w:proofErr w:type="spellEnd"/>
+        <w:t>vscode-styled-components</w:t>
+      </w:r>
       <w:r>
         <w:rPr>
           <w:b/>
           <w:bCs/>
           <w:lang w:val="en-US"/>
         </w:rPr>
-        <w:t>-styled-components</w:t>
-      </w:r>
-      <w:r>
-        <w:rPr>
-          <w:b/>
-          <w:bCs/>
-          <w:lang w:val="en-US"/>
-        </w:rPr>
         <w:t xml:space="preserve"> </w:t>
       </w:r>
       <w:r>
         <w:rPr>
           <w:lang w:val="en-US"/>
         </w:rPr>
-        <w:t xml:space="preserve">for supporting syntax and </w:t>
-      </w:r>
-      <w:proofErr w:type="spellStart"/>
-      <w:r>
-        <w:rPr>
-          <w:lang w:val="en-US"/>
-        </w:rPr>
-        <w:t>highliting</w:t>
-      </w:r>
-      <w:proofErr w:type="spellEnd"/>
-      <w:r>
-        <w:rPr>
-          <w:lang w:val="en-US"/>
-        </w:rPr>
-        <w:t xml:space="preserve"> errors.</w:t>
+        <w:t>for supporting syntax and highliting errors.</w:t>
       </w:r>
       <w:r>
         <w:rPr>
@@ -106,21 +68,7 @@
         <w:rPr>
           <w:lang w:val="en-US"/>
         </w:rPr>
-        <w:t xml:space="preserve"> library like </w:t>
-      </w:r>
-      <w:proofErr w:type="spellStart"/>
-      <w:r>
-        <w:rPr>
-          <w:lang w:val="en-US"/>
-        </w:rPr>
-        <w:t>navlink</w:t>
-      </w:r>
-      <w:proofErr w:type="spellEnd"/>
-      <w:r>
-        <w:rPr>
-          <w:lang w:val="en-US"/>
-        </w:rPr>
-        <w:t xml:space="preserve"> from react router you can put it inside brackets</w:t>
+        <w:t xml:space="preserve"> library like navlink from react router you can put it inside brackets</w:t>
       </w:r>
       <w:r>
         <w:rPr>
@@ -345,21 +293,7 @@
         <w:rPr>
           <w:lang w:val="en-US"/>
         </w:rPr>
-        <w:t xml:space="preserve">Then browser is sure its </w:t>
-      </w:r>
-      <w:proofErr w:type="spellStart"/>
-      <w:r>
-        <w:rPr>
-          <w:lang w:val="en-US"/>
-        </w:rPr>
-        <w:t>exatly</w:t>
-      </w:r>
-      <w:proofErr w:type="spellEnd"/>
-      <w:r>
-        <w:rPr>
-          <w:lang w:val="en-US"/>
-        </w:rPr>
-        <w:t xml:space="preserve"> table or row</w:t>
+        <w:t>Then browser is sure its exatly table or row</w:t>
       </w:r>
     </w:p>
     <w:p>
@@ -426,35 +360,7 @@
         <w:rPr>
           <w:lang w:val="en-US"/>
         </w:rPr>
-        <w:t xml:space="preserve">Verry </w:t>
-      </w:r>
-      <w:proofErr w:type="spellStart"/>
-      <w:r>
-        <w:rPr>
-          <w:lang w:val="en-US"/>
-        </w:rPr>
-        <w:t>pupular</w:t>
-      </w:r>
-      <w:proofErr w:type="spellEnd"/>
-      <w:r>
-        <w:rPr>
-          <w:lang w:val="en-US"/>
-        </w:rPr>
-        <w:t xml:space="preserve"> </w:t>
-      </w:r>
-      <w:proofErr w:type="spellStart"/>
-      <w:r>
-        <w:rPr>
-          <w:lang w:val="en-US"/>
-        </w:rPr>
-        <w:t>libarary</w:t>
-      </w:r>
-      <w:proofErr w:type="spellEnd"/>
-      <w:r>
-        <w:rPr>
-          <w:lang w:val="en-US"/>
-        </w:rPr>
-        <w:t xml:space="preserve"> to manipulation or calculation with dates </w:t>
+        <w:t xml:space="preserve">Verry pupular libarary to manipulation or calculation with dates </w:t>
       </w:r>
       <w:r>
         <w:rPr>
@@ -564,69 +470,13 @@
         <w:rPr>
           <w:lang w:val="en-US"/>
         </w:rPr>
-        <w:t xml:space="preserve"> – Allow us to render totally different component in certain component for example order list with different </w:t>
-      </w:r>
-      <w:proofErr w:type="spellStart"/>
-      <w:r>
-        <w:rPr>
-          <w:lang w:val="en-US"/>
-        </w:rPr>
-        <w:t>contentents</w:t>
-      </w:r>
-      <w:proofErr w:type="spellEnd"/>
-      <w:r>
-        <w:rPr>
-          <w:lang w:val="en-US"/>
-        </w:rPr>
-        <w:t xml:space="preserve">. </w:t>
-      </w:r>
-      <w:r>
-        <w:rPr>
-          <w:lang w:val="en-US"/>
-        </w:rPr>
-        <w:t xml:space="preserve">We need to include render prop as function that allow us to render this list&gt; </w:t>
-      </w:r>
-      <w:proofErr w:type="spellStart"/>
-      <w:r>
-        <w:rPr>
-          <w:lang w:val="en-US"/>
-        </w:rPr>
-        <w:t>its</w:t>
-      </w:r>
-      <w:proofErr w:type="spellEnd"/>
-      <w:r>
-        <w:rPr>
-          <w:lang w:val="en-US"/>
-        </w:rPr>
-        <w:t xml:space="preserve"> not verry </w:t>
-      </w:r>
-      <w:proofErr w:type="spellStart"/>
-      <w:r>
-        <w:rPr>
-          <w:lang w:val="en-US"/>
-        </w:rPr>
-        <w:t>offen</w:t>
-      </w:r>
-      <w:proofErr w:type="spellEnd"/>
-      <w:r>
-        <w:rPr>
-          <w:lang w:val="en-US"/>
-        </w:rPr>
-        <w:t xml:space="preserve"> used but still can be </w:t>
-      </w:r>
-      <w:proofErr w:type="spellStart"/>
-      <w:r>
-        <w:rPr>
-          <w:lang w:val="en-US"/>
-        </w:rPr>
-        <w:t>usefull</w:t>
-      </w:r>
-      <w:proofErr w:type="spellEnd"/>
-      <w:r>
-        <w:rPr>
-          <w:lang w:val="en-US"/>
-        </w:rPr>
-        <w:t xml:space="preserve">. Mostly we use custom hooks, but this example is perfect for render function. </w:t>
+        <w:t xml:space="preserve"> – Allow us to render totally different component in certain component for example order list with different contentents. </w:t>
+      </w:r>
+      <w:r>
+        <w:rPr>
+          <w:lang w:val="en-US"/>
+        </w:rPr>
+        <w:t xml:space="preserve">We need to include render prop as function that allow us to render this list&gt; its not verry offen used but still can be usefull. Mostly we use custom hooks, but this example is perfect for render function. </w:t>
       </w:r>
     </w:p>
     <w:p>
@@ -772,25 +622,7 @@
           <w:bCs/>
           <w:lang w:val="en-US"/>
         </w:rPr>
-        <w:t xml:space="preserve">. For example we can have reusable logic that add toggle for component (any component we want) and reuses it </w:t>
-      </w:r>
-      <w:proofErr w:type="spellStart"/>
-      <w:r>
-        <w:rPr>
-          <w:b/>
-          <w:bCs/>
-          <w:lang w:val="en-US"/>
-        </w:rPr>
-        <w:t>accrose</w:t>
-      </w:r>
-      <w:proofErr w:type="spellEnd"/>
-      <w:r>
-        <w:rPr>
-          <w:b/>
-          <w:bCs/>
-          <w:lang w:val="en-US"/>
-        </w:rPr>
-        <w:t xml:space="preserve"> app.</w:t>
+        <w:t>. For example we can have reusable logic that add toggle for component (any component we want) and reuses it accrose app.</w:t>
       </w:r>
     </w:p>
     <w:p>
@@ -860,71 +692,19 @@
           <w:lang w:val="en-US"/>
         </w:rPr>
       </w:pPr>
-      <w:proofErr w:type="spellStart"/>
       <w:r>
         <w:rPr>
           <w:b/>
           <w:bCs/>
           <w:lang w:val="en-US"/>
         </w:rPr>
-        <w:t>Compund</w:t>
-      </w:r>
-      <w:proofErr w:type="spellEnd"/>
-      <w:r>
-        <w:rPr>
-          <w:b/>
-          <w:bCs/>
-          <w:lang w:val="en-US"/>
-        </w:rPr>
-        <w:t xml:space="preserve"> component –</w:t>
-      </w:r>
-      <w:r>
-        <w:rPr>
-          <w:lang w:val="en-US"/>
-        </w:rPr>
-        <w:t xml:space="preserve"> Allow to create reusable components with flexible props. For example button that want to have label or </w:t>
-      </w:r>
-      <w:proofErr w:type="spellStart"/>
-      <w:r>
-        <w:rPr>
-          <w:lang w:val="en-US"/>
-        </w:rPr>
-        <w:t>antoher</w:t>
-      </w:r>
-      <w:proofErr w:type="spellEnd"/>
-      <w:r>
-        <w:rPr>
-          <w:lang w:val="en-US"/>
-        </w:rPr>
-        <w:t xml:space="preserve"> that will have </w:t>
-      </w:r>
-      <w:proofErr w:type="spellStart"/>
-      <w:r>
-        <w:rPr>
-          <w:lang w:val="en-US"/>
-        </w:rPr>
-        <w:t>lale</w:t>
-      </w:r>
-      <w:proofErr w:type="spellEnd"/>
-      <w:r>
-        <w:rPr>
-          <w:lang w:val="en-US"/>
-        </w:rPr>
-        <w:t xml:space="preserve"> and icon. Independent </w:t>
-      </w:r>
-      <w:proofErr w:type="spellStart"/>
-      <w:r>
-        <w:rPr>
-          <w:lang w:val="en-US"/>
-        </w:rPr>
-        <w:t>labet</w:t>
-      </w:r>
-      <w:proofErr w:type="spellEnd"/>
-      <w:r>
-        <w:rPr>
-          <w:lang w:val="en-US"/>
-        </w:rPr>
-        <w:t xml:space="preserve"> position (left/right). Help create flexible components without props hell </w:t>
+        <w:t>Compund component –</w:t>
+      </w:r>
+      <w:r>
+        <w:rPr>
+          <w:lang w:val="en-US"/>
+        </w:rPr>
+        <w:t xml:space="preserve"> Allow to create reusable components with flexible props. For example button that want to have label or antoher that will have lale and icon. Independent labet position (left/right). Help create flexible components without props hell </w:t>
       </w:r>
     </w:p>
     <w:p>
@@ -1058,59 +838,13 @@
           <w:lang w:val="en-US"/>
         </w:rPr>
         <w:lastRenderedPageBreak/>
-        <w:t xml:space="preserve">If you want to avoid cutting modal component (or different </w:t>
-      </w:r>
-      <w:proofErr w:type="spellStart"/>
-      <w:r>
-        <w:rPr>
-          <w:b/>
-          <w:bCs/>
-          <w:lang w:val="en-US"/>
-        </w:rPr>
-        <w:t>componenets</w:t>
-      </w:r>
-      <w:proofErr w:type="spellEnd"/>
-      <w:r>
-        <w:rPr>
-          <w:b/>
-          <w:bCs/>
-          <w:lang w:val="en-US"/>
-        </w:rPr>
-        <w:t xml:space="preserve">) </w:t>
-      </w:r>
-      <w:r>
-        <w:rPr>
-          <w:lang w:val="en-US"/>
-        </w:rPr>
-        <w:t xml:space="preserve"> for example z-index or overflow you can use portal and assign your component to </w:t>
-      </w:r>
-      <w:proofErr w:type="spellStart"/>
-      <w:r>
-        <w:rPr>
-          <w:lang w:val="en-US"/>
-        </w:rPr>
-        <w:t>dom</w:t>
-      </w:r>
-      <w:proofErr w:type="spellEnd"/>
-      <w:r>
-        <w:rPr>
-          <w:lang w:val="en-US"/>
-        </w:rPr>
-        <w:t xml:space="preserve"> then I will render in top of the </w:t>
-      </w:r>
-      <w:proofErr w:type="spellStart"/>
-      <w:r>
-        <w:rPr>
-          <w:lang w:val="en-US"/>
-        </w:rPr>
-        <w:t>dom</w:t>
-      </w:r>
-      <w:proofErr w:type="spellEnd"/>
-      <w:r>
-        <w:rPr>
-          <w:lang w:val="en-US"/>
-        </w:rPr>
-        <w:t xml:space="preserve"> </w:t>
+        <w:t xml:space="preserve">If you want to avoid cutting modal component (or different componenets) </w:t>
+      </w:r>
+      <w:r>
+        <w:rPr>
+          <w:lang w:val="en-US"/>
+        </w:rPr>
+        <w:t xml:space="preserve"> for example z-index or overflow you can use portal and assign your component to dom then I will render in top of the dom </w:t>
       </w:r>
     </w:p>
     <w:p>
@@ -1173,7 +907,6 @@
         </w:rPr>
         <w:t xml:space="preserve">If you want to create reusable components you can use </w:t>
       </w:r>
-      <w:proofErr w:type="spellStart"/>
       <w:r>
         <w:rPr>
           <w:b/>
@@ -1182,78 +915,22 @@
         </w:rPr>
         <w:t>cloneelement</w:t>
       </w:r>
-      <w:proofErr w:type="spellEnd"/>
-      <w:r>
-        <w:rPr>
-          <w:lang w:val="en-US"/>
-        </w:rPr>
-        <w:t xml:space="preserve"> nested function in react. It allows you to add </w:t>
-      </w:r>
-      <w:proofErr w:type="spellStart"/>
-      <w:r>
-        <w:rPr>
-          <w:lang w:val="en-US"/>
-        </w:rPr>
-        <w:t>behaviour</w:t>
-      </w:r>
-      <w:proofErr w:type="spellEnd"/>
-      <w:r>
-        <w:rPr>
-          <w:lang w:val="en-US"/>
-        </w:rPr>
-        <w:t xml:space="preserve"> to children for example you have attached button in &lt;</w:t>
-      </w:r>
-      <w:proofErr w:type="spellStart"/>
-      <w:r>
-        <w:rPr>
-          <w:lang w:val="en-US"/>
-        </w:rPr>
-        <w:t>Modal.Open</w:t>
-      </w:r>
-      <w:proofErr w:type="spellEnd"/>
-      <w:r>
-        <w:rPr>
-          <w:lang w:val="en-US"/>
-        </w:rPr>
-        <w:t>&gt; &lt;/</w:t>
-      </w:r>
-      <w:proofErr w:type="spellStart"/>
-      <w:r>
-        <w:rPr>
-          <w:lang w:val="en-US"/>
-        </w:rPr>
-        <w:t>Modal.open</w:t>
-      </w:r>
-      <w:proofErr w:type="spellEnd"/>
-      <w:r>
-        <w:rPr>
-          <w:lang w:val="en-US"/>
-        </w:rPr>
-        <w:t xml:space="preserve">&gt;  then you can create </w:t>
-      </w:r>
-      <w:proofErr w:type="spellStart"/>
-      <w:r>
-        <w:rPr>
-          <w:lang w:val="en-US"/>
-        </w:rPr>
-        <w:t>behaviour</w:t>
-      </w:r>
-      <w:proofErr w:type="spellEnd"/>
-      <w:r>
-        <w:rPr>
-          <w:lang w:val="en-US"/>
-        </w:rPr>
-        <w:t xml:space="preserve"> that clicking in button open your modal. </w:t>
-      </w:r>
-    </w:p>
-    <w:p>
-      <w:pPr>
-        <w:rPr>
-          <w:lang w:val="en-US"/>
-        </w:rPr>
-      </w:pPr>
-      <w:r>
-        <w:rPr>
+      <w:r>
+        <w:rPr>
+          <w:lang w:val="en-US"/>
+        </w:rPr>
+        <w:t xml:space="preserve"> nested function in react. It allows you to add behaviour to children for example you have attached button in &lt;Modal.Open&gt; &lt;/Modal.open&gt;  then you can create behaviour that clicking in button open your modal. </w:t>
+      </w:r>
+    </w:p>
+    <w:p>
+      <w:pPr>
+        <w:rPr>
+          <w:lang w:val="en-US"/>
+        </w:rPr>
+      </w:pPr>
+      <w:r>
+        <w:rPr>
+          <w:noProof/>
           <w:lang w:val="en-US"/>
         </w:rPr>
         <w:drawing>
@@ -1314,6 +991,7 @@
       </w:pPr>
       <w:r>
         <w:rPr>
+          <w:noProof/>
           <w:lang w:val="en-US"/>
         </w:rPr>
         <w:lastRenderedPageBreak/>
@@ -1364,20 +1042,7 @@
           <w:lang w:val="en-US"/>
         </w:rPr>
         <w:br/>
-      </w:r>
-      <w:proofErr w:type="spellStart"/>
-      <w:r>
-        <w:rPr>
-          <w:lang w:val="en-US"/>
-        </w:rPr>
-        <w:t>Neverthelless</w:t>
-      </w:r>
-      <w:proofErr w:type="spellEnd"/>
-      <w:r>
-        <w:rPr>
-          <w:lang w:val="en-US"/>
-        </w:rPr>
-        <w:t xml:space="preserve"> its not visible from modal perspective which can be confusing. Alternative for that is nesting child </w:t>
+        <w:t xml:space="preserve">Neverthelless its not visible from modal perspective which can be confusing. Alternative for that is nesting child </w:t>
       </w:r>
       <w:r>
         <w:rPr>
@@ -1393,6 +1058,7 @@
       </w:r>
       <w:r>
         <w:rPr>
+          <w:noProof/>
           <w:lang w:val="en-US"/>
         </w:rPr>
         <w:drawing>
@@ -1438,6 +1104,20 @@
           <w:lang w:val="en-US"/>
         </w:rPr>
       </w:pPr>
+      <w:r>
+        <w:rPr>
+          <w:b/>
+          <w:bCs/>
+          <w:lang w:val="en-US"/>
+        </w:rPr>
+        <w:t xml:space="preserve">Prefetching – </w:t>
+      </w:r>
+      <w:r>
+        <w:rPr>
+          <w:lang w:val="en-US"/>
+        </w:rPr>
+        <w:t>rendering data before user interface. For example if click page number 7 we fetch data for page 8 in cache.</w:t>
+      </w:r>
     </w:p>
     <w:sectPr>
       <w:pgSz w:w="11906" w:h="16838"/>

</xml_diff>